<commit_message>
feat(module-02): repositionnement exercice 02.a avant les applications, renommage 02.b, repartition 50/50 des points (5 pts / 5 pts) et video Power Query
</commit_message>
<xml_diff>
--- a/docs/public/documents/Exercice-02.docx
+++ b/docs/public/documents/Exercice-02.docx
@@ -13,24 +13,7 @@
         </w:rPr>
       </w:pPr>
       <w:r>
-        <w:rPr>
-          <w:rFonts w:ascii="Segoe UI" w:hAnsi="Segoe UI" w:cs="Segoe UI"/>
-          <w:b/>
-          <w:bCs/>
-          <w:sz w:val="32"/>
-          <w:szCs w:val="32"/>
-        </w:rPr>
-        <w:t>Exercice 02</w:t>
-      </w:r>
-      <w:r>
-        <w:rPr>
-          <w:rFonts w:ascii="Segoe UI" w:hAnsi="Segoe UI" w:cs="Segoe UI"/>
-          <w:b/>
-          <w:bCs/>
-          <w:sz w:val="32"/>
-          <w:szCs w:val="32"/>
-        </w:rPr>
-        <w:t xml:space="preserve"> — Quel outil pour quelle situation ?</w:t>
+        <w:t>Exercice 02.b — Quel outil pour quelle situation ?</w:t>
       </w:r>
     </w:p>
     <w:p>

</xml_diff>